<commit_message>
P11 — isi worksheet dan tangkapan layar simpanan
Isi lembar A–F di docx P11 dan tambahkan dua tangkapan layar E.4: simpanan
sah sebelum dirusak, dan halaman yang pulih ke nilai bawaan sesudahnya.

Co-Authored-By: Claude Opus 5.5 <noreply@anthropic.com>
</commit_message>
<xml_diff>
--- a/P11/MUHAMMAD ARIF RAHMAN JALIL - - 11. Worksheet_PABW_Pertemuan11 - ID.docx
+++ b/P11/MUHAMMAD ARIF RAHMAN JALIL - - 11. Worksheet_PABW_Pertemuan11 - ID.docx
@@ -181,6 +181,13 @@
             <w:pPr>
               <w:spacing w:after="0"/>
             </w:pPr>
+            <w:r>
+              <w:rPr>
+                <w:color w:val="1A1A2E"/>
+                <w:sz w:val="18"/>
+              </w:rPr>
+              <w:t>Muhammad Arif Rahman Jalil</w:t>
+            </w:r>
           </w:p>
         </w:tc>
         <w:tc>
@@ -223,6 +230,13 @@
             <w:pPr>
               <w:spacing w:after="0"/>
             </w:pPr>
+            <w:r>
+              <w:rPr>
+                <w:color w:val="1A1A2E"/>
+                <w:sz w:val="18"/>
+              </w:rPr>
+              <w:t>23523132</w:t>
+            </w:r>
           </w:p>
         </w:tc>
       </w:tr>
@@ -270,6 +284,13 @@
             <w:pPr>
               <w:spacing w:after="0"/>
             </w:pPr>
+            <w:r>
+              <w:rPr>
+                <w:color w:val="1A1A2E"/>
+                <w:sz w:val="18"/>
+              </w:rPr>
+              <w:t>B</w:t>
+            </w:r>
           </w:p>
         </w:tc>
         <w:tc>
@@ -312,6 +333,13 @@
             <w:pPr>
               <w:spacing w:after="0"/>
             </w:pPr>
+            <w:r>
+              <w:rPr>
+                <w:color w:val="1A1A2E"/>
+                <w:sz w:val="18"/>
+              </w:rPr>
+              <w:t>16 Oktober 2026</w:t>
+            </w:r>
           </w:p>
         </w:tc>
       </w:tr>
@@ -2052,10 +2080,10 @@
             </w:pPr>
             <w:r>
               <w:rPr>
-                <w:rFonts w:cs="Carlito"/>
-                <w:sz w:val="18"/>
-              </w:rPr>
-              <w:t xml:space="preserve"/>
+                <w:color w:val="1A1A2E"/>
+                <w:sz w:val="18"/>
+              </w:rPr>
+              <w:t>Ada</w:t>
             </w:r>
           </w:p>
         </w:tc>
@@ -2075,10 +2103,10 @@
             </w:pPr>
             <w:r>
               <w:rPr>
-                <w:rFonts w:cs="Carlito"/>
-                <w:sz w:val="18"/>
-              </w:rPr>
-              <w:t xml:space="preserve"/>
+                <w:color w:val="1A1A2E"/>
+                <w:sz w:val="18"/>
+              </w:rPr>
+              <w:t>155 (salinan P10)</w:t>
             </w:r>
           </w:p>
         </w:tc>
@@ -2151,10 +2179,10 @@
             </w:pPr>
             <w:r>
               <w:rPr>
-                <w:rFonts w:cs="Carlito"/>
-                <w:sz w:val="18"/>
-              </w:rPr>
-              <w:t xml:space="preserve"/>
+                <w:color w:val="1A1A2E"/>
+                <w:sz w:val="18"/>
+              </w:rPr>
+              <w:t>Ada</w:t>
             </w:r>
           </w:p>
         </w:tc>
@@ -2174,10 +2202,10 @@
             </w:pPr>
             <w:r>
               <w:rPr>
-                <w:rFonts w:cs="Carlito"/>
-                <w:sz w:val="18"/>
-              </w:rPr>
-              <w:t xml:space="preserve"/>
+                <w:color w:val="1A1A2E"/>
+                <w:sz w:val="18"/>
+              </w:rPr>
+              <w:t>493 (tokens 47, base 32, layout 86, komponen 252, responsif 33, tema 43)</w:t>
             </w:r>
           </w:p>
         </w:tc>
@@ -2250,10 +2278,10 @@
             </w:pPr>
             <w:r>
               <w:rPr>
-                <w:rFonts w:cs="Carlito"/>
-                <w:sz w:val="18"/>
-              </w:rPr>
-              <w:t xml:space="preserve"/>
+                <w:color w:val="1A1A2E"/>
+                <w:sz w:val="18"/>
+              </w:rPr>
+              <w:t>Ada</w:t>
             </w:r>
           </w:p>
         </w:tc>
@@ -2273,10 +2301,10 @@
             </w:pPr>
             <w:r>
               <w:rPr>
-                <w:rFonts w:cs="Carlito"/>
-                <w:sz w:val="18"/>
-              </w:rPr>
-              <w:t xml:space="preserve"/>
+                <w:color w:val="1A1A2E"/>
+                <w:sz w:val="18"/>
+              </w:rPr>
+              <w:t>165</w:t>
             </w:r>
           </w:p>
         </w:tc>
@@ -2349,10 +2377,10 @@
             </w:pPr>
             <w:r>
               <w:rPr>
-                <w:rFonts w:cs="Carlito"/>
-                <w:sz w:val="18"/>
-              </w:rPr>
-              <w:t xml:space="preserve"/>
+                <w:color w:val="1A1A2E"/>
+                <w:sz w:val="18"/>
+              </w:rPr>
+              <w:t>Ada</w:t>
             </w:r>
           </w:p>
         </w:tc>
@@ -2372,10 +2400,10 @@
             </w:pPr>
             <w:r>
               <w:rPr>
-                <w:rFonts w:cs="Carlito"/>
-                <w:sz w:val="18"/>
-              </w:rPr>
-              <w:t xml:space="preserve"/>
+                <w:color w:val="1A1A2E"/>
+                <w:sz w:val="18"/>
+              </w:rPr>
+              <w:t>238 (versi P10, sudah memanggil api.js)</w:t>
             </w:r>
           </w:p>
         </w:tc>
@@ -2528,10 +2556,10 @@
             </w:pPr>
             <w:r>
               <w:rPr>
-                <w:rFonts w:cs="Carlito"/>
-                <w:sz w:val="18"/>
-              </w:rPr>
-              <w:t xml:space="preserve"/>
+                <w:color w:val="1A1A2E"/>
+                <w:sz w:val="18"/>
+              </w:rPr>
+              <w:t>api.js</w:t>
             </w:r>
           </w:p>
         </w:tc>
@@ -2551,10 +2579,10 @@
             </w:pPr>
             <w:r>
               <w:rPr>
-                <w:rFonts w:cs="Carlito"/>
-                <w:sz w:val="18"/>
-              </w:rPr>
-              <w:t xml:space="preserve"/>
+                <w:color w:val="1A1A2E"/>
+                <w:sz w:val="18"/>
+              </w:rPr>
+              <w:t>Tidak. Tidak ada modul hari ini yang bernama api.js</w:t>
             </w:r>
           </w:p>
         </w:tc>
@@ -2574,10 +2602,10 @@
             </w:pPr>
             <w:r>
               <w:rPr>
-                <w:rFonts w:cs="Carlito"/>
-                <w:sz w:val="18"/>
-              </w:rPr>
-              <w:t xml:space="preserve"/>
+                <w:color w:val="1A1A2E"/>
+                <w:sz w:val="18"/>
+              </w:rPr>
+              <w:t>Diimpor apa adanya, tidak diubah, dihitung terpisah dari lima modul</w:t>
             </w:r>
           </w:p>
         </w:tc>
@@ -2604,10 +2632,10 @@
             </w:pPr>
             <w:r>
               <w:rPr>
-                <w:rFonts w:cs="Carlito"/>
-                <w:sz w:val="18"/>
-              </w:rPr>
-              <w:t xml:space="preserve"/>
+                <w:color w:val="1A1A2E"/>
+                <w:sz w:val="18"/>
+              </w:rPr>
+              <w:t>app.js, dom.js (versi P10)</w:t>
             </w:r>
           </w:p>
         </w:tc>
@@ -2627,10 +2655,10 @@
             </w:pPr>
             <w:r>
               <w:rPr>
-                <w:rFonts w:cs="Carlito"/>
-                <w:sz w:val="18"/>
-              </w:rPr>
-              <w:t xml:space="preserve"/>
+                <w:color w:val="1A1A2E"/>
+                <w:sz w:val="18"/>
+              </w:rPr>
+              <w:t>Ya, tetapi keduanya memang berkas yang dipecah hari ini</w:t>
             </w:r>
           </w:p>
         </w:tc>
@@ -2650,10 +2678,10 @@
             </w:pPr>
             <w:r>
               <w:rPr>
-                <w:rFonts w:cs="Carlito"/>
-                <w:sz w:val="18"/>
-              </w:rPr>
-              <w:t xml:space="preserve"/>
+                <w:color w:val="1A1A2E"/>
+                <w:sz w:val="18"/>
+              </w:rPr>
+              <w:t>Dipakai sebagai bahan awal; isinya dipindah ke lima modul</w:t>
             </w:r>
           </w:p>
         </w:tc>
@@ -2680,10 +2708,10 @@
             </w:pPr>
             <w:r>
               <w:rPr>
-                <w:rFonts w:cs="Carlito"/>
-                <w:sz w:val="18"/>
-              </w:rPr>
-              <w:t xml:space="preserve"/>
+                <w:color w:val="1A1A2E"/>
+                <w:sz w:val="18"/>
+              </w:rPr>
+              <w:t>—</w:t>
             </w:r>
           </w:p>
         </w:tc>
@@ -2703,10 +2731,10 @@
             </w:pPr>
             <w:r>
               <w:rPr>
-                <w:rFonts w:cs="Carlito"/>
-                <w:sz w:val="18"/>
-              </w:rPr>
-              <w:t xml:space="preserve"/>
+                <w:color w:val="1A1A2E"/>
+                <w:sz w:val="18"/>
+              </w:rPr>
+              <w:t>—</w:t>
             </w:r>
           </w:p>
         </w:tc>
@@ -2726,10 +2754,10 @@
             </w:pPr>
             <w:r>
               <w:rPr>
-                <w:rFonts w:cs="Carlito"/>
-                <w:sz w:val="18"/>
-              </w:rPr>
-              <w:t xml:space="preserve"/>
+                <w:color w:val="1A1A2E"/>
+                <w:sz w:val="18"/>
+              </w:rPr>
+              <w:t>Tidak ada berkas lain dari P10</w:t>
             </w:r>
           </w:p>
         </w:tc>
@@ -2948,10 +2976,10 @@
             </w:pPr>
             <w:r>
               <w:rPr>
-                <w:rFonts w:cs="Carlito"/>
-                <w:sz w:val="18"/>
-              </w:rPr>
-              <w:t xml:space="preserve"/>
+                <w:color w:val="1A1A2E"/>
+                <w:sz w:val="18"/>
+              </w:rPr>
+              <w:t>165</w:t>
             </w:r>
           </w:p>
         </w:tc>
@@ -2971,10 +2999,10 @@
             </w:pPr>
             <w:r>
               <w:rPr>
-                <w:rFonts w:cs="Carlito"/>
-                <w:sz w:val="18"/>
-              </w:rPr>
-              <w:t xml:space="preserve"/>
+                <w:color w:val="1A1A2E"/>
+                <w:sz w:val="18"/>
+              </w:rPr>
+              <w:t>1 baris berkata kunci (querySelector di isiElemen), tetapi isiElemen dipanggil 9 kali dan memasang innerHTML, ditambah document.title</w:t>
             </w:r>
           </w:p>
         </w:tc>
@@ -3024,10 +3052,10 @@
             </w:pPr>
             <w:r>
               <w:rPr>
-                <w:rFonts w:cs="Carlito"/>
-                <w:sz w:val="18"/>
-              </w:rPr>
-              <w:t xml:space="preserve"/>
+                <w:color w:val="1A1A2E"/>
+                <w:sz w:val="18"/>
+              </w:rPr>
+              <w:t>238</w:t>
             </w:r>
           </w:p>
         </w:tc>
@@ -3047,10 +3075,10 @@
             </w:pPr>
             <w:r>
               <w:rPr>
-                <w:rFonts w:cs="Carlito"/>
-                <w:sz w:val="18"/>
-              </w:rPr>
-              <w:t xml:space="preserve"/>
+                <w:color w:val="1A1A2E"/>
+                <w:sz w:val="18"/>
+              </w:rPr>
+              <w:t>27</w:t>
             </w:r>
           </w:p>
         </w:tc>
@@ -3249,10 +3277,10 @@
             </w:pPr>
             <w:r>
               <w:rPr>
-                <w:rFonts w:cs="Carlito"/>
-                <w:sz w:val="18"/>
-              </w:rPr>
-              <w:t xml:space="preserve"/>
+                <w:color w:val="1A1A2E"/>
+                <w:sz w:val="18"/>
+              </w:rPr>
+              <w:t>app.js P8/P9: profil, daftarLatihan, daftarTarget, buatPerkenalan, formatKeahlian, hitungTotal, formatAngka, formatTanggal; aturan validasi dari dom.js</w:t>
             </w:r>
           </w:p>
         </w:tc>
@@ -3325,10 +3353,10 @@
             </w:pPr>
             <w:r>
               <w:rPr>
-                <w:rFonts w:cs="Carlito"/>
-                <w:sz w:val="18"/>
-              </w:rPr>
-              <w:t xml:space="preserve"/>
+                <w:color w:val="1A1A2E"/>
+                <w:sz w:val="18"/>
+              </w:rPr>
+              <w:t>Baru. Keadaan yang tadinya di dom.js: kategori aktif (kelas .aktif), sudahDikirim, kolomDisentuh, status referensi</w:t>
             </w:r>
           </w:p>
         </w:tc>
@@ -3401,10 +3429,10 @@
             </w:pPr>
             <w:r>
               <w:rPr>
-                <w:rFonts w:cs="Carlito"/>
-                <w:sz w:val="18"/>
-              </w:rPr>
-              <w:t xml:space="preserve"/>
+                <w:color w:val="1A1A2E"/>
+                <w:sz w:val="18"/>
+              </w:rPr>
+              <w:t>dom.js P10 (buatKartu, render, gambarLatihan) ditambah isiElemen dan buatBarisLatihan dari app.js</w:t>
             </w:r>
           </w:p>
         </w:tc>
@@ -3477,10 +3505,10 @@
             </w:pPr>
             <w:r>
               <w:rPr>
-                <w:rFonts w:cs="Carlito"/>
-                <w:sz w:val="18"/>
-              </w:rPr>
-              <w:t xml:space="preserve"/>
+                <w:color w:val="1A1A2E"/>
+                <w:sz w:val="18"/>
+              </w:rPr>
+              <w:t>Semua addEventListener dari dom.js P10: klik filter, input, change, submit form</w:t>
             </w:r>
           </w:p>
         </w:tc>
@@ -3553,10 +3581,10 @@
             </w:pPr>
             <w:r>
               <w:rPr>
-                <w:rFonts w:cs="Carlito"/>
-                <w:sz w:val="18"/>
-              </w:rPr>
-              <w:t xml:space="preserve"/>
+                <w:color w:val="1A1A2E"/>
+                <w:sz w:val="18"/>
+              </w:rPr>
+              <w:t>Sisa app.js dikosongkan; console.log latihan P8 dan buatKartuTarget (kode mati sejak P9) dibuang</w:t>
             </w:r>
           </w:p>
         </w:tc>
@@ -3680,6 +3708,13 @@
             <w:pPr>
               <w:spacing w:before="20" w:after="20" w:line="252" w:lineRule="auto"/>
             </w:pPr>
+            <w:r>
+              <w:rPr>
+                <w:color w:val="1A1A2E"/>
+                <w:sz w:val="18"/>
+              </w:rPr>
+              <w:t>✓ (folder P11/)</w:t>
+            </w:r>
           </w:p>
         </w:tc>
       </w:tr>
@@ -3726,6 +3761,13 @@
             <w:pPr>
               <w:spacing w:before="20" w:after="20" w:line="252" w:lineRule="auto"/>
             </w:pPr>
+            <w:r>
+              <w:rPr>
+                <w:color w:val="1A1A2E"/>
+                <w:sz w:val="18"/>
+              </w:rPr>
+              <w:t>✓</w:t>
+            </w:r>
           </w:p>
         </w:tc>
       </w:tr>
@@ -3772,6 +3814,13 @@
             <w:pPr>
               <w:spacing w:before="20" w:after="20" w:line="252" w:lineRule="auto"/>
             </w:pPr>
+            <w:r>
+              <w:rPr>
+                <w:color w:val="1A1A2E"/>
+                <w:sz w:val="18"/>
+              </w:rPr>
+              <w:t>✓</w:t>
+            </w:r>
           </w:p>
         </w:tc>
       </w:tr>
@@ -3818,6 +3867,13 @@
             <w:pPr>
               <w:spacing w:before="20" w:after="20" w:line="252" w:lineRule="auto"/>
             </w:pPr>
+            <w:r>
+              <w:rPr>
+                <w:color w:val="1A1A2E"/>
+                <w:sz w:val="18"/>
+              </w:rPr>
+              <w:t>✓</w:t>
+            </w:r>
           </w:p>
         </w:tc>
       </w:tr>
@@ -3864,6 +3920,13 @@
             <w:pPr>
               <w:spacing w:before="20" w:after="20" w:line="252" w:lineRule="auto"/>
             </w:pPr>
+            <w:r>
+              <w:rPr>
+                <w:color w:val="1A1A2E"/>
+                <w:sz w:val="18"/>
+              </w:rPr>
+              <w:t>✓</w:t>
+            </w:r>
           </w:p>
         </w:tc>
       </w:tr>
@@ -4078,16 +4141,6 @@
         </w:rPr>
         <w:t xml:space="preserve">Cara memastikan: buka Console. Halaman berjalan persis seperti akhir Pertemuan 9, tanpa satu galat pun.</w:t>
       </w:r>
-    </w:p>
-    <w:p>
-      <w:pPr>
-        <w:spacing w:after="60"/>
-      </w:pPr>
-    </w:p>
-    <w:p>
-      <w:pPr>
-        <w:spacing w:after="60"/>
-      </w:pPr>
     </w:p>
     <w:p>
       <w:r>
@@ -5782,10 +5835,10 @@
             </w:pPr>
             <w:r>
               <w:rPr>
-                <w:rFonts w:cs="Carlito"/>
-                <w:sz w:val="18"/>
-              </w:rPr>
-              <w:t xml:space="preserve"/>
+                <w:color w:val="1A1A2E"/>
+                <w:sz w:val="18"/>
+              </w:rPr>
+              <w:t>Bersih; hanya log biasa dari api.js P10, tanpa pesan merah atau kuning</w:t>
             </w:r>
           </w:p>
         </w:tc>
@@ -5858,10 +5911,10 @@
             </w:pPr>
             <w:r>
               <w:rPr>
-                <w:rFonts w:cs="Carlito"/>
-                <w:sz w:val="18"/>
-              </w:rPr>
-              <w:t xml:space="preserve"/>
+                <w:color w:val="1A1A2E"/>
+                <w:sz w:val="18"/>
+              </w:rPr>
+              <w:t>Sama: 5 kartu target, Kardio 2 kartu, Fleksibilitas menampilkan pesan kosong, validasi form, 6 kartu wger</w:t>
             </w:r>
           </w:p>
         </w:tc>
@@ -5934,10 +5987,10 @@
             </w:pPr>
             <w:r>
               <w:rPr>
-                <w:rFonts w:cs="Carlito"/>
-                <w:sz w:val="18"/>
-              </w:rPr>
-              <w:t xml:space="preserve"/>
+                <w:color w:val="1A1A2E"/>
+                <w:sz w:val="18"/>
+              </w:rPr>
+              <w:t>Hanya import dan pemanggilan (19 baris)</w:t>
             </w:r>
           </w:p>
         </w:tc>
@@ -6010,10 +6063,10 @@
             </w:pPr>
             <w:r>
               <w:rPr>
-                <w:rFonts w:cs="Carlito"/>
-                <w:sz w:val="18"/>
-              </w:rPr>
-              <w:t xml:space="preserve"/>
+                <w:color w:val="1A1A2E"/>
+                <w:sz w:val="18"/>
+              </w:rPr>
+              <w:t>5 wajib + api.js (P10) + simpanan.js (localStorage)</w:t>
             </w:r>
           </w:p>
         </w:tc>
@@ -6086,10 +6139,10 @@
             </w:pPr>
             <w:r>
               <w:rPr>
-                <w:rFonts w:cs="Carlito"/>
-                <w:sz w:val="18"/>
-              </w:rPr>
-              <w:t xml:space="preserve"/>
+                <w:color w:val="1A1A2E"/>
+                <w:sz w:val="18"/>
+              </w:rPr>
+              <w:t>Semua berbentuk './nama.js'</w:t>
             </w:r>
           </w:p>
         </w:tc>
@@ -7526,10 +7579,10 @@
             </w:pPr>
             <w:r>
               <w:rPr>
-                <w:rFonts w:cs="Carlito"/>
-                <w:sz w:val="18"/>
-              </w:rPr>
-              <w:t xml:space="preserve"/>
+                <w:color w:val="1A1A2E"/>
+                <w:sz w:val="18"/>
+              </w:rPr>
+              <w:t>Klik Kardio: state.kategoriAktif 'semua' menjadi 'kardio', isi state lain tetap</w:t>
             </w:r>
           </w:p>
         </w:tc>
@@ -7602,10 +7655,10 @@
             </w:pPr>
             <w:r>
               <w:rPr>
-                <w:rFonts w:cs="Carlito"/>
-                <w:sz w:val="18"/>
-              </w:rPr>
-              <w:t xml:space="preserve"/>
+                <w:color w:val="1A1A2E"/>
+                <w:sz w:val="18"/>
+              </w:rPr>
+              <w:t>{ kategoriAktif, temaDibalik, daftarProyek, form, referensi } dalam satu objek</w:t>
             </w:r>
           </w:p>
         </w:tc>
@@ -7678,10 +7731,10 @@
             </w:pPr>
             <w:r>
               <w:rPr>
-                <w:rFonts w:cs="Carlito"/>
-                <w:sz w:val="18"/>
-              </w:rPr>
-              <w:t xml:space="preserve"/>
+                <w:color w:val="1A1A2E"/>
+                <w:sz w:val="18"/>
+              </w:rPr>
+              <w:t>Kelas .aktif, aria-invalid, dan pesan galat tidak pernah dibaca; events.js hanya membaca elemen yang diklik/diketik</w:t>
             </w:r>
           </w:p>
         </w:tc>
@@ -7754,10 +7807,10 @@
             </w:pPr>
             <w:r>
               <w:rPr>
-                <w:rFonts w:cs="Carlito"/>
-                <w:sz w:val="18"/>
-              </w:rPr>
-              <w:t xml:space="preserve"/>
+                <w:color w:val="1A1A2E"/>
+                <w:sz w:val="18"/>
+              </w:rPr>
+              <w:t>render(state) dua kali: tetap 2 kartu, tombol Kardio tetap aktif, tidak berlipat</w:t>
             </w:r>
           </w:p>
         </w:tc>
@@ -9002,10 +9055,10 @@
             </w:pPr>
             <w:r>
               <w:rPr>
-                <w:rFonts w:cs="Carlito"/>
-                <w:sz w:val="18"/>
-              </w:rPr>
-              <w:t xml:space="preserve"/>
+                <w:color w:val="1A1A2E"/>
+                <w:sz w:val="18"/>
+              </w:rPr>
+              <w:t>"semua"</w:t>
             </w:r>
           </w:p>
         </w:tc>
@@ -9025,10 +9078,10 @@
             </w:pPr>
             <w:r>
               <w:rPr>
-                <w:rFonts w:cs="Carlito"/>
-                <w:sz w:val="18"/>
-              </w:rPr>
-              <w:t xml:space="preserve"/>
+                <w:color w:val="1A1A2E"/>
+                <w:sz w:val="18"/>
+              </w:rPr>
+              <w:t>Kunjungan pertama menampilkan kelima target, sama dengan tombol aktif di HTML P9</w:t>
             </w:r>
           </w:p>
         </w:tc>
@@ -9078,10 +9131,10 @@
             </w:pPr>
             <w:r>
               <w:rPr>
-                <w:rFonts w:cs="Carlito"/>
-                <w:sz w:val="18"/>
-              </w:rPr>
-              <w:t xml:space="preserve"/>
+                <w:color w:val="1A1A2E"/>
+                <w:sz w:val="18"/>
+              </w:rPr>
+              <w:t>Tidak ada fitur urutan; target tampil sesuai urutan di data.js</w:t>
             </w:r>
           </w:p>
         </w:tc>
@@ -9101,10 +9154,10 @@
             </w:pPr>
             <w:r>
               <w:rPr>
-                <w:rFonts w:cs="Carlito"/>
-                <w:sz w:val="18"/>
-              </w:rPr>
-              <w:t xml:space="preserve"/>
+                <w:color w:val="1A1A2E"/>
+                <w:sz w:val="18"/>
+              </w:rPr>
+              <w:t>P11 tidak menambah fitur. Pilihan kedua yang saya simpan adalah tema: bawaan false (ikut sistem)</w:t>
             </w:r>
           </w:p>
         </w:tc>
@@ -9777,10 +9830,10 @@
             </w:pPr>
             <w:r>
               <w:rPr>
-                <w:rFonts w:cs="Carlito"/>
-                <w:sz w:val="18"/>
-              </w:rPr>
-              <w:t xml:space="preserve"/>
+                <w:color w:val="1A1A2E"/>
+                <w:sz w:val="18"/>
+              </w:rPr>
+              <w:t>Ya</w:t>
             </w:r>
           </w:p>
         </w:tc>
@@ -9800,10 +9853,10 @@
             </w:pPr>
             <w:r>
               <w:rPr>
-                <w:rFonts w:cs="Carlito"/>
-                <w:sz w:val="18"/>
-              </w:rPr>
-              <w:t xml:space="preserve"/>
+                <w:color w:val="1A1A2E"/>
+                <w:sz w:val="18"/>
+              </w:rPr>
+              <w:t>Pilihan tampilan kecil; pengguna tidak perlu memilih ulang setiap membuka halaman</w:t>
             </w:r>
           </w:p>
         </w:tc>
@@ -9853,10 +9906,10 @@
             </w:pPr>
             <w:r>
               <w:rPr>
-                <w:rFonts w:cs="Carlito"/>
-                <w:sz w:val="18"/>
-              </w:rPr>
-              <w:t xml:space="preserve"/>
+                <w:color w:val="1A1A2E"/>
+                <w:sz w:val="18"/>
+              </w:rPr>
+              <w:t>Tidak (halaman tidak punya pencarian)</w:t>
             </w:r>
           </w:p>
         </w:tc>
@@ -9876,10 +9929,10 @@
             </w:pPr>
             <w:r>
               <w:rPr>
-                <w:rFonts w:cs="Carlito"/>
-                <w:sz w:val="18"/>
-              </w:rPr>
-              <w:t xml:space="preserve"/>
+                <w:color w:val="1A1A2E"/>
+                <w:sz w:val="18"/>
+              </w:rPr>
+              <w:t>Berubah tiap ketikan dan localStorage sinkron, jadi menulisnya tiap ketikan menahan halaman; kata kunci lama juga jarang berguna</w:t>
             </w:r>
           </w:p>
         </w:tc>
@@ -11076,10 +11129,10 @@
             </w:pPr>
             <w:r>
               <w:rPr>
-                <w:rFonts w:cs="Carlito"/>
-                <w:sz w:val="18"/>
-              </w:rPr>
-              <w:t xml:space="preserve"/>
+                <w:color w:val="1A1A2E"/>
+                <w:sz w:val="18"/>
+              </w:rPr>
+              <w:t>Setelah dimuat ulang halaman terbuka, kategori kembali Semua, tema ikut sistem; getItem('pabw-p11') menjadi null; Console tanpa galat</w:t>
             </w:r>
           </w:p>
         </w:tc>
@@ -11152,10 +11205,10 @@
             </w:pPr>
             <w:r>
               <w:rPr>
-                <w:rFonts w:cs="Carlito"/>
-                <w:sz w:val="18"/>
-              </w:rPr>
-              <w:t xml:space="preserve"/>
+                <w:color w:val="1A1A2E"/>
+                <w:sz w:val="18"/>
+              </w:rPr>
+              <w:t>versi undefined ≠ 1: simpanan dibuang, nilai bawaan dipakai, getItem menjadi null</w:t>
             </w:r>
           </w:p>
         </w:tc>
@@ -11228,10 +11281,10 @@
             </w:pPr>
             <w:r>
               <w:rPr>
-                <w:rFonts w:cs="Carlito"/>
-                <w:sz w:val="18"/>
-              </w:rPr>
-              <w:t xml:space="preserve"/>
+                <w:color w:val="1A1A2E"/>
+                <w:sz w:val="18"/>
+              </w:rPr>
+              <w:t>null setelah 'bukan-json'; dengan simpanan sah: {versi: 1, kategoriAktif: 'kardio', temaDibalik: true}</w:t>
             </w:r>
           </w:p>
         </w:tc>
@@ -11348,10 +11401,10 @@
             </w:pPr>
             <w:r>
               <w:rPr>
-                <w:rFonts w:cs="Carlito"/>
-                <w:sz w:val="19"/>
-              </w:rPr>
-              <w:t xml:space="preserve"/>
+                <w:color w:val="1A1A2E"/>
+                <w:sz w:val="18"/>
+              </w:rPr>
+              <w:t>Token dan kata sandi</w:t>
             </w:r>
           </w:p>
         </w:tc>
@@ -11401,10 +11454,10 @@
             </w:pPr>
             <w:r>
               <w:rPr>
-                <w:rFonts w:cs="Carlito"/>
-                <w:sz w:val="19"/>
-              </w:rPr>
-              <w:t xml:space="preserve"/>
+                <w:color w:val="1A1A2E"/>
+                <w:sz w:val="18"/>
+              </w:rPr>
+              <w:t>Data pribadi (nama, NIM), isian form yang belum dikirim, data referensi wger.de</w:t>
             </w:r>
           </w:p>
         </w:tc>
@@ -11424,10 +11477,10 @@
             </w:pPr>
             <w:r>
               <w:rPr>
-                <w:rFonts w:cs="Carlito"/>
-                <w:sz w:val="19"/>
-              </w:rPr>
-              <w:t xml:space="preserve"/>
+                <w:color w:val="1A1A2E"/>
+                <w:sz w:val="18"/>
+              </w:rPr>
+              <w:t>Data pribadi tidak terenkripsi; isian form berubah tiap ketikan; data referensi besar dan selalu bisa diambil ulang</w:t>
             </w:r>
           </w:p>
         </w:tc>
@@ -11476,6 +11529,102 @@
         </w:tc>
       </w:tr>
     </w:tbl>
+    <w:p>
+      <w:pPr>
+        <w:keepNext/>
+      </w:pPr>
+      <w:r>
+        <w:rPr>
+          <w:color w:val="1A1A2E"/>
+          <w:sz w:val="18"/>
+        </w:rPr>
+        <w:t>Sebelum dirusak: simpanan sah {versi: 1, kategoriAktif: 'kardio', temaDibalik: true}. Kardio aktif, tema dibalik.</w:t>
+      </w:r>
+    </w:p>
+    <w:p>
+      <w:r>
+        <w:drawing>
+          <wp:inline xmlns:a="http://schemas.openxmlformats.org/drawingml/2006/main" xmlns:pic="http://schemas.openxmlformats.org/drawingml/2006/picture">
+            <wp:extent cx="3960000" cy="2835285"/>
+            <wp:docPr id="2" name="Picture 2"/>
+            <wp:cNvGraphicFramePr>
+              <a:graphicFrameLocks noChangeAspect="1"/>
+            </wp:cNvGraphicFramePr>
+            <a:graphic>
+              <a:graphicData uri="http://schemas.openxmlformats.org/drawingml/2006/picture">
+                <pic:pic>
+                  <pic:nvPicPr>
+                    <pic:cNvPr id="0" name="p11-simpanan-sah.png"/>
+                    <pic:cNvPicPr/>
+                  </pic:nvPicPr>
+                  <pic:blipFill>
+                    <a:blip r:embed="rId12"/>
+                    <a:stretch>
+                      <a:fillRect/>
+                    </a:stretch>
+                  </pic:blipFill>
+                  <pic:spPr>
+                    <a:xfrm>
+                      <a:off x="0" y="0"/>
+                      <a:ext cx="3960000" cy="2835285"/>
+                    </a:xfrm>
+                    <a:prstGeom prst="rect"/>
+                  </pic:spPr>
+                </pic:pic>
+              </a:graphicData>
+            </a:graphic>
+          </wp:inline>
+        </w:drawing>
+      </w:r>
+    </w:p>
+    <w:p>
+      <w:pPr>
+        <w:keepNext/>
+      </w:pPr>
+      <w:r>
+        <w:rPr>
+          <w:color w:val="1A1A2E"/>
+          <w:sz w:val="18"/>
+        </w:rPr>
+        <w:t>Sesudah localStorage.setItem("pabw-p11", "bukan-json") lalu muat ulang: halaman tetap terbuka dengan nilai bawaan (Semua, tema ikut sistem); simpanan dibuang.</w:t>
+      </w:r>
+    </w:p>
+    <w:p>
+      <w:r>
+        <w:drawing>
+          <wp:inline xmlns:a="http://schemas.openxmlformats.org/drawingml/2006/main" xmlns:pic="http://schemas.openxmlformats.org/drawingml/2006/picture">
+            <wp:extent cx="3960000" cy="2835285"/>
+            <wp:docPr id="1" name="Picture 1"/>
+            <wp:cNvGraphicFramePr>
+              <a:graphicFrameLocks noChangeAspect="1"/>
+            </wp:cNvGraphicFramePr>
+            <a:graphic>
+              <a:graphicData uri="http://schemas.openxmlformats.org/drawingml/2006/picture">
+                <pic:pic>
+                  <pic:nvPicPr>
+                    <pic:cNvPr id="0" name="p11-simpanan-pulih.png"/>
+                    <pic:cNvPicPr/>
+                  </pic:nvPicPr>
+                  <pic:blipFill>
+                    <a:blip r:embed="rId11"/>
+                    <a:stretch>
+                      <a:fillRect/>
+                    </a:stretch>
+                  </pic:blipFill>
+                  <pic:spPr>
+                    <a:xfrm>
+                      <a:off x="0" y="0"/>
+                      <a:ext cx="3960000" cy="2835285"/>
+                    </a:xfrm>
+                    <a:prstGeom prst="rect"/>
+                  </pic:spPr>
+                </pic:pic>
+              </a:graphicData>
+            </a:graphic>
+          </wp:inline>
+        </w:drawing>
+      </w:r>
+    </w:p>
     <w:p>
       <w:pPr>
         <w:spacing w:after="60"/>
@@ -11883,7 +12032,15 @@
               <w:right w:val="single" w:sz="4" w:space="0" w:color="B9C6E2"/>
             </w:tcBorders>
           </w:tcPr>
-          <w:p/>
+          <w:p>
+            <w:r>
+              <w:rPr>
+                <w:color w:val="1A1A2E"/>
+                <w:sz w:val="18"/>
+              </w:rPr>
+              <w:t>js/data.js: menyimpan data mentah (profil, daftarLatihan, daftarProyek, KATEGORI) dan fungsi murni seperti formatTanggal dan aturanForm.</w:t>
+            </w:r>
+          </w:p>
         </w:tc>
       </w:tr>
       <w:tr>
@@ -11900,7 +12057,15 @@
               <w:right w:val="single" w:sz="4" w:space="0" w:color="B9C6E2"/>
             </w:tcBorders>
           </w:tcPr>
-          <w:p/>
+          <w:p>
+            <w:r>
+              <w:rPr>
+                <w:color w:val="1A1A2E"/>
+                <w:sz w:val="18"/>
+              </w:rPr>
+              <w:t>Diimpor oleh js/dom.js (buatPerkenalan, formatTanggal, aturanForm) dan js/state.js (daftarProyek, KATEGORI, formSah); app.js juga mengimpor profil dan daftarLatihan.</w:t>
+            </w:r>
+          </w:p>
         </w:tc>
       </w:tr>
     </w:tbl>
@@ -11945,7 +12110,15 @@
               <w:right w:val="single" w:sz="4" w:space="0" w:color="B9C6E2"/>
             </w:tcBorders>
           </w:tcPr>
-          <w:p/>
+          <w:p>
+            <w:r>
+              <w:rPr>
+                <w:color w:val="1A1A2E"/>
+                <w:sz w:val="18"/>
+              </w:rPr>
+              <w:t>Peramban tidak mencari berkas sendiri: tanpa ./ teksnya dianggap nama paket (bare specifier), dan peramban tidak menambah .js, jadi jalurnya harus menunjuk berkas yang benar-benar ada.</w:t>
+            </w:r>
+          </w:p>
         </w:tc>
       </w:tr>
       <w:tr>
@@ -11962,7 +12135,15 @@
               <w:right w:val="single" w:sz="4" w:space="0" w:color="B9C6E2"/>
             </w:tcBorders>
           </w:tcPr>
-          <w:p/>
+          <w:p>
+            <w:r>
+              <w:rPr>
+                <w:color w:val="1A1A2E"/>
+                <w:sz w:val="18"/>
+              </w:rPr>
+              <w:t>Tanpa ./ muncul TypeError: Failed to resolve module specifier "data"; tanpa .js permintaan ke js/data dijawab 404 dan modul gagal dimuat.</w:t>
+            </w:r>
+          </w:p>
         </w:tc>
       </w:tr>
     </w:tbl>
@@ -12007,7 +12188,15 @@
               <w:right w:val="single" w:sz="4" w:space="0" w:color="B9C6E2"/>
             </w:tcBorders>
           </w:tcPr>
-          <w:p/>
+          <w:p>
+            <w:r>
+              <w:rPr>
+                <w:color w:val="1A1A2E"/>
+                <w:sz w:val="18"/>
+              </w:rPr>
+              <w:t>Di DOM: sebagai kelas .aktif dan aria-pressed pada tombol filter, sedangkan kategorinya dibaca dari dataset.kategori tombol yang diklik.</w:t>
+            </w:r>
+          </w:p>
         </w:tc>
       </w:tr>
       <w:tr>
@@ -12024,7 +12213,15 @@
               <w:right w:val="single" w:sz="4" w:space="0" w:color="B9C6E2"/>
             </w:tcBorders>
           </w:tcPr>
-          <w:p/>
+          <w:p>
+            <w:r>
+              <w:rPr>
+                <w:color w:val="1A1A2E"/>
+                <w:sz w:val="18"/>
+              </w:rPr>
+              <w:t>Saat digambar ulang elemen baru tidak membawa keadaan itu dan kelas bisa berbeda dari daftar yang tampil; tidak ada satu sumber yang bisa diperiksa atau disimpan.</w:t>
+            </w:r>
+          </w:p>
         </w:tc>
       </w:tr>
     </w:tbl>
@@ -12069,7 +12266,15 @@
               <w:right w:val="single" w:sz="4" w:space="0" w:color="B9C6E2"/>
             </w:tcBorders>
           </w:tcPr>
-          <w:p/>
+          <w:p>
+            <w:r>
+              <w:rPr>
+                <w:color w:val="1A1A2E"/>
+                <w:sz w:val="18"/>
+              </w:rPr>
+              <w:t>Ganti null dengan nilai bawaan sebelum dipakai: muat() mengembalikan null, lalu state.js memakai ?? BAWAAN (kategoriAktif "semua", temaDibalik false).</w:t>
+            </w:r>
+          </w:p>
         </w:tc>
       </w:tr>
       <w:tr>
@@ -12086,7 +12291,15 @@
               <w:right w:val="single" w:sz="4" w:space="0" w:color="B9C6E2"/>
             </w:tcBorders>
           </w:tcPr>
-          <w:p/>
+          <w:p>
+            <w:r>
+              <w:rPr>
+                <w:color w:val="1A1A2E"/>
+                <w:sz w:val="18"/>
+              </w:rPr>
+              <w:t>Nilai yang tidak dikenal juga diganti bawaan: kategori diperiksa dengan KATEGORI.includes, tema dengan typeof boolean.</w:t>
+            </w:r>
+          </w:p>
         </w:tc>
       </w:tr>
     </w:tbl>
@@ -12131,7 +12344,15 @@
               <w:right w:val="single" w:sz="4" w:space="0" w:color="B9C6E2"/>
             </w:tcBorders>
           </w:tcPr>
-          <w:p/>
+          <w:p>
+            <w:r>
+              <w:rPr>
+                <w:color w:val="1A1A2E"/>
+                <w:sz w:val="18"/>
+              </w:rPr>
+              <w:t>Simpanan hanya pilihan tampilan. Bila JSON.parse melempar galat tanpa ditangkap, seluruh modul berhenti dan halaman kosong, dan itu terulang setiap kali halaman dimuat.</w:t>
+            </w:r>
+          </w:p>
         </w:tc>
       </w:tr>
       <w:tr>
@@ -12148,7 +12369,15 @@
               <w:right w:val="single" w:sz="4" w:space="0" w:color="B9C6E2"/>
             </w:tcBorders>
           </w:tcPr>
-          <w:p/>
+          <w:p>
+            <w:r>
+              <w:rPr>
+                <w:color w:val="1A1A2E"/>
+                <w:sz w:val="18"/>
+              </w:rPr>
+              <w:t>muat() membungkus JSON.parse dengan try/catch, memeriksa isi?.versi !== VERSI, membuang simpanan dengan removeItem, lalu mengembalikan null sehingga nilai bawaan dipakai.</w:t>
+            </w:r>
+          </w:p>
         </w:tc>
       </w:tr>
     </w:tbl>
@@ -12193,7 +12422,15 @@
               <w:right w:val="single" w:sz="4" w:space="0" w:color="B9C6E2"/>
             </w:tcBorders>
           </w:tcPr>
-          <w:p/>
+          <w:p>
+            <w:r>
+              <w:rPr>
+                <w:color w:val="1A1A2E"/>
+                <w:sz w:val="18"/>
+              </w:rPr>
+              <w:t>Boleh: kategori aktif dan pilihan tema, misalnya {versi: 1, kategoriAktif: "kardio", temaDibalik: true}. Tidak boleh: token login atau kata sandi.</w:t>
+            </w:r>
+          </w:p>
         </w:tc>
       </w:tr>
       <w:tr>
@@ -12210,7 +12447,15 @@
               <w:right w:val="single" w:sz="4" w:space="0" w:color="B9C6E2"/>
             </w:tcBorders>
           </w:tcPr>
-          <w:p/>
+          <w:p>
+            <w:r>
+              <w:rPr>
+                <w:color w:val="1A1A2E"/>
+                <w:sz w:val="18"/>
+              </w:rPr>
+              <w:t>Pilihan tampilan tidak rahasia. localStorage tidak terenkripsi dan bisa dibaca siapa pun yang memakai komputer itu atau skrip di alamat yang sama.</w:t>
+            </w:r>
+          </w:p>
         </w:tc>
       </w:tr>
     </w:tbl>
@@ -12272,7 +12517,7 @@
                 <w:color w:val="003796"/>
                 <w:sz w:val="22"/>
               </w:rPr>
-              <w:t xml:space="preserve">☐  Berkas  lima modul ada di repositori: data.js, state.js, dom.js, events.js, app.js — ditambah berkas dari P10 bila ada</w:t>
+              <w:t>☑  Berkas  lima modul ada di repositori: data.js, state.js, dom.js, events.js, app.js — ditambah berkas dari P10 bila ada</w:t>
             </w:r>
           </w:p>
         </w:tc>
@@ -12308,7 +12553,7 @@
                 <w:color w:val="003796"/>
                 <w:sz w:val="22"/>
               </w:rPr>
-              <w:t xml:space="preserve">☐  Impor  seluruh jalur berawalan ./ dan berakhiran .js; Console bersih tanpa satu pun galat impor</w:t>
+              <w:t>☑  Impor  seluruh jalur berawalan ./ dan berakhiran .js; Console bersih tanpa satu pun galat impor</w:t>
             </w:r>
           </w:p>
         </w:tc>
@@ -12344,7 +12589,7 @@
                 <w:color w:val="003796"/>
                 <w:sz w:val="22"/>
               </w:rPr>
-              <w:t xml:space="preserve">☐  Perilaku  halaman bekerja persis seperti akhir Pertemuan 9; tidak ada fitur baru yang ditambahkan</w:t>
+              <w:t>☑  Perilaku  halaman bekerja persis seperti akhir Pertemuan 9; tidak ada fitur baru yang ditambahkan</w:t>
             </w:r>
           </w:p>
         </w:tc>
@@ -12380,7 +12625,7 @@
                 <w:color w:val="003796"/>
                 <w:sz w:val="22"/>
               </w:rPr>
-              <w:t xml:space="preserve">☐  State  seluruh keadaan yang bisa berubah berada di satu objek state, dan tidak ada keadaan yang dibaca kembali dari DOM</w:t>
+              <w:t>☑  State  seluruh keadaan yang bisa berubah berada di satu objek state, dan tidak ada keadaan yang dibaca kembali dari DOM</w:t>
             </w:r>
           </w:p>
         </w:tc>
@@ -12416,7 +12661,7 @@
                 <w:color w:val="003796"/>
                 <w:sz w:val="22"/>
               </w:rPr>
-              <w:t xml:space="preserve">☐  Pengubah  setiap perubahan keadaan ditulis sebagai fungsi bernama di state.js, dan fungsi itulah yang memanggil render</w:t>
+              <w:t>☑  Pengubah  setiap perubahan keadaan ditulis sebagai fungsi bernama di state.js, dan fungsi itulah yang memanggil render</w:t>
             </w:r>
           </w:p>
         </w:tc>
@@ -12452,7 +12697,7 @@
                 <w:color w:val="003796"/>
                 <w:sz w:val="22"/>
               </w:rPr>
-              <w:t xml:space="preserve">☐  Simpanan  pilihan bertahan setelah tab ditutup; JSON dipakai; nilai bawaan terpasang; tombol atur ulang bekerja</w:t>
+              <w:t>☑  Simpanan  pilihan bertahan setelah tab ditutup; JSON dipakai; nilai bawaan terpasang; tombol atur ulang bekerja</w:t>
             </w:r>
           </w:p>
         </w:tc>
@@ -12488,7 +12733,7 @@
                 <w:color w:val="003796"/>
                 <w:sz w:val="22"/>
               </w:rPr>
-              <w:t xml:space="preserve">☐  Simpanan rusak  try/catch dipakai, nomor versi diperiksa, dan saya sudah mencoba merusaknya sendiri dari Console</w:t>
+              <w:t>☑  Simpanan rusak  try/catch dipakai, nomor versi diperiksa, dan saya sudah mencoba merusaknya sendiri dari Console</w:t>
             </w:r>
           </w:p>
         </w:tc>
@@ -12524,7 +12769,7 @@
                 <w:color w:val="003796"/>
                 <w:sz w:val="22"/>
               </w:rPr>
-              <w:t xml:space="preserve">☐  Deklarasi AI  bagian README menyebutkan bagian mana yang dibantu AI dan bagian mana yang saya kerjakan sendiri</w:t>
+              <w:t>☑  Deklarasi AI  bagian README menyebutkan bagian mana yang dibantu AI dan bagian mana yang saya kerjakan sendiri</w:t>
             </w:r>
           </w:p>
         </w:tc>
@@ -12560,7 +12805,7 @@
                 <w:color w:val="003796"/>
                 <w:sz w:val="22"/>
               </w:rPr>
-              <w:t xml:space="preserve">☐  Git  ada lebih dari satu commit hari ini, dan pesan commit-nya menjelaskan isinya</w:t>
+              <w:t>☑  Git  ada lebih dari satu commit hari ini, dan pesan commit-nya menjelaskan isinya</w:t>
             </w:r>
           </w:p>
         </w:tc>
@@ -12765,10 +13010,10 @@
             </w:pPr>
             <w:r>
               <w:rPr>
-                <w:rFonts w:cs="Carlito"/>
-                <w:sz w:val="18"/>
-              </w:rPr>
-              <w:t xml:space="preserve"/>
+                <w:color w:val="1A1A2E"/>
+                <w:sz w:val="18"/>
+              </w:rPr>
+              <w:t>v22.15.0</w:t>
             </w:r>
           </w:p>
         </w:tc>
@@ -12788,10 +13033,10 @@
             </w:pPr>
             <w:r>
               <w:rPr>
-                <w:rFonts w:cs="Carlito"/>
-                <w:sz w:val="18"/>
-              </w:rPr>
-              <w:t xml:space="preserve"/>
+                <w:color w:val="1A1A2E"/>
+                <w:sz w:val="18"/>
+              </w:rPr>
+              <w:t>Berhasil; Node 22 adalah jalur LTS</w:t>
             </w:r>
           </w:p>
         </w:tc>
@@ -12841,10 +13086,10 @@
             </w:pPr>
             <w:r>
               <w:rPr>
-                <w:rFonts w:cs="Carlito"/>
-                <w:sz w:val="18"/>
-              </w:rPr>
-              <w:t xml:space="preserve"/>
+                <w:color w:val="1A1A2E"/>
+                <w:sz w:val="18"/>
+              </w:rPr>
+              <w:t>10.9.2</w:t>
             </w:r>
           </w:p>
         </w:tc>
@@ -12864,10 +13109,10 @@
             </w:pPr>
             <w:r>
               <w:rPr>
-                <w:rFonts w:cs="Carlito"/>
-                <w:sz w:val="18"/>
-              </w:rPr>
-              <w:t xml:space="preserve"/>
+                <w:color w:val="1A1A2E"/>
+                <w:sz w:val="18"/>
+              </w:rPr>
+              <w:t>Berhasil</w:t>
             </w:r>
           </w:p>
         </w:tc>
@@ -12924,7 +13169,15 @@
               <w:right w:val="single" w:sz="4" w:space="0" w:color="B9C6E2"/>
             </w:tcBorders>
           </w:tcPr>
-          <w:p/>
+          <w:p>
+            <w:r>
+              <w:rPr>
+                <w:color w:val="1A1A2E"/>
+                <w:sz w:val="18"/>
+              </w:rPr>
+              <w:t>Kelas .aktif itu hasil gambar, bukan sumber: panggil render(state) dua kali dan console.log(state) sebelum percaya keadaan sudah keluar dari DOM.</w:t>
+            </w:r>
+          </w:p>
         </w:tc>
       </w:tr>
       <w:tr>
@@ -13003,7 +13256,7 @@
                 <w:color w:val="003796"/>
                 <w:sz w:val="22"/>
               </w:rPr>
-              <w:t xml:space="preserve">☐  Pengungkapan AI  README menyebutkan bagian mana yang dibantu AI dan bagian mana yang saya kerjakan sendiri</w:t>
+              <w:t>☑  Pengungkapan AI  README menyebutkan bagian mana yang dibantu AI dan bagian mana yang saya kerjakan sendiri</w:t>
             </w:r>
           </w:p>
         </w:tc>
@@ -13039,7 +13292,7 @@
                 <w:color w:val="003796"/>
                 <w:sz w:val="22"/>
               </w:rPr>
-              <w:t xml:space="preserve">☐  Keaslian  topik dan isi halaman ini milik saya sendiri, tidak menyalin pekerjaan mahasiswa lain</w:t>
+              <w:t>☑  Keaslian  topik dan isi halaman ini milik saya sendiri, tidak menyalin pekerjaan mahasiswa lain</w:t>
             </w:r>
           </w:p>
         </w:tc>
@@ -13242,10 +13495,10 @@
             </w:pPr>
             <w:r>
               <w:rPr>
-                <w:rFonts w:cs="Carlito"/>
-                <w:sz w:val="18"/>
-              </w:rPr>
-              <w:t xml:space="preserve"/>
+                <w:color w:val="1A1A2E"/>
+                <w:sz w:val="18"/>
+              </w:rPr>
+              <w:t>25</w:t>
             </w:r>
           </w:p>
         </w:tc>
@@ -13265,10 +13518,10 @@
             </w:pPr>
             <w:r>
               <w:rPr>
-                <w:rFonts w:cs="Carlito"/>
-                <w:sz w:val="18"/>
-              </w:rPr>
-              <w:t xml:space="preserve"/>
+                <w:color w:val="1A1A2E"/>
+                <w:sz w:val="18"/>
+              </w:rPr>
+              <w:t>js/data.js, state.js, dom.js, events.js, app.js (19 baris, hanya import dan pemanggilan); profil.html satu &lt;script type="module"&gt;</w:t>
             </w:r>
           </w:p>
         </w:tc>
@@ -13341,10 +13594,10 @@
             </w:pPr>
             <w:r>
               <w:rPr>
-                <w:rFonts w:cs="Carlito"/>
-                <w:sz w:val="18"/>
-              </w:rPr>
-              <w:t xml:space="preserve"/>
+                <w:color w:val="1A1A2E"/>
+                <w:sz w:val="18"/>
+              </w:rPr>
+              <w:t>25</w:t>
             </w:r>
           </w:p>
         </w:tc>
@@ -13364,10 +13617,10 @@
             </w:pPr>
             <w:r>
               <w:rPr>
-                <w:rFonts w:cs="Carlito"/>
-                <w:sz w:val="18"/>
-              </w:rPr>
-              <w:t xml:space="preserve"/>
+                <w:color w:val="1A1A2E"/>
+                <w:sz w:val="18"/>
+              </w:rPr>
+              <w:t>state.js: satu objek state dan fungsi pengubah yang memanggil render; dom.js: render(state) dan saring(state)</w:t>
             </w:r>
           </w:p>
         </w:tc>
@@ -13440,10 +13693,10 @@
             </w:pPr>
             <w:r>
               <w:rPr>
-                <w:rFonts w:cs="Carlito"/>
-                <w:sz w:val="18"/>
-              </w:rPr>
-              <w:t xml:space="preserve"/>
+                <w:color w:val="1A1A2E"/>
+                <w:sz w:val="18"/>
+              </w:rPr>
+              <w:t>25</w:t>
             </w:r>
           </w:p>
         </w:tc>
@@ -13463,10 +13716,10 @@
             </w:pPr>
             <w:r>
               <w:rPr>
-                <w:rFonts w:cs="Carlito"/>
-                <w:sz w:val="18"/>
-              </w:rPr>
-              <w:t xml:space="preserve"/>
+                <w:color w:val="1A1A2E"/>
+                <w:sz w:val="18"/>
+              </w:rPr>
+              <w:t>simpanan.js: simpan/muat/aturUlang dengan JSON.stringify/parse; BAWAAN di state.js; tombol #atur-ulang</w:t>
             </w:r>
           </w:p>
         </w:tc>
@@ -13539,10 +13792,10 @@
             </w:pPr>
             <w:r>
               <w:rPr>
-                <w:rFonts w:cs="Carlito"/>
-                <w:sz w:val="18"/>
-              </w:rPr>
-              <w:t xml:space="preserve"/>
+                <w:color w:val="1A1A2E"/>
+                <w:sz w:val="18"/>
+              </w:rPr>
+              <w:t>15</w:t>
             </w:r>
           </w:p>
         </w:tc>
@@ -13562,10 +13815,10 @@
             </w:pPr>
             <w:r>
               <w:rPr>
-                <w:rFonts w:cs="Carlito"/>
-                <w:sz w:val="18"/>
-              </w:rPr>
-              <w:t xml:space="preserve"/>
+                <w:color w:val="1A1A2E"/>
+                <w:sz w:val="18"/>
+              </w:rPr>
+              <w:t>simpanan.js muat(): try/catch, pemeriksaan versi, removeItem; tangkapan/p11-simpanan-sah.png dan p11-simpanan-pulih.png</w:t>
             </w:r>
           </w:p>
         </w:tc>
@@ -13638,10 +13891,10 @@
             </w:pPr>
             <w:r>
               <w:rPr>
-                <w:rFonts w:cs="Carlito"/>
-                <w:sz w:val="18"/>
-              </w:rPr>
-              <w:t xml:space="preserve"/>
+                <w:color w:val="1A1A2E"/>
+                <w:sz w:val="18"/>
+              </w:rPr>
+              <w:t>10</w:t>
             </w:r>
           </w:p>
         </w:tc>
@@ -13661,10 +13914,10 @@
             </w:pPr>
             <w:r>
               <w:rPr>
-                <w:rFonts w:cs="Carlito"/>
-                <w:sz w:val="18"/>
-              </w:rPr>
-              <w:t xml:space="preserve"/>
+                <w:color w:val="1A1A2E"/>
+                <w:sz w:val="18"/>
+              </w:rPr>
+              <w:t>README bagian Pertemuan 11 dan Deklarasi AI; 6 commit P11; kode mati P8/P9 dibuang</w:t>
             </w:r>
           </w:p>
         </w:tc>
@@ -13737,10 +13990,10 @@
             </w:pPr>
             <w:r>
               <w:rPr>
-                <w:rFonts w:cs="Carlito"/>
-                <w:sz w:val="18"/>
-              </w:rPr>
-              <w:t xml:space="preserve"/>
+                <w:color w:val="1A1A2E"/>
+                <w:sz w:val="18"/>
+              </w:rPr>
+              <w:t>100</w:t>
             </w:r>
           </w:p>
         </w:tc>
@@ -13760,10 +14013,10 @@
             </w:pPr>
             <w:r>
               <w:rPr>
-                <w:rFonts w:cs="Carlito"/>
-                <w:sz w:val="18"/>
-              </w:rPr>
-              <w:t xml:space="preserve"/>
+                <w:color w:val="1A1A2E"/>
+                <w:sz w:val="18"/>
+              </w:rPr>
+              <w:t>—</w:t>
             </w:r>
           </w:p>
         </w:tc>
@@ -13820,7 +14073,15 @@
               <w:right w:val="single" w:sz="4" w:space="0" w:color="B9C6E2"/>
             </w:tcBorders>
           </w:tcPr>
-          <w:p/>
+          <w:p>
+            <w:r>
+              <w:rPr>
+                <w:color w:val="1A1A2E"/>
+                <w:sz w:val="18"/>
+              </w:rPr>
+              <w:t>Memindahkan isian form ke state: render menulis ulang nilai kolom tanpa membuat kursor melompat, dan aturan validasi dipisah menjadi fungsi murni di data.js.</w:t>
+            </w:r>
+          </w:p>
         </w:tc>
       </w:tr>
       <w:tr>
@@ -13878,7 +14139,15 @@
               <w:right w:val="single" w:sz="4" w:space="0" w:color="B9C6E2"/>
             </w:tcBorders>
           </w:tcPr>
-          <w:p/>
+          <w:p>
+            <w:r>
+              <w:rPr>
+                <w:color w:val="1A1A2E"/>
+                <w:sz w:val="18"/>
+              </w:rPr>
+              <w:t>Apakah isian form memang perlu masuk state atau cukup dibaca saat dikirim, dan cara memindahkan state.js serta render(state) ke Vue di Pertemuan 12.</w:t>
+            </w:r>
+          </w:p>
         </w:tc>
       </w:tr>
       <w:tr>
@@ -13936,7 +14205,15 @@
               <w:right w:val="single" w:sz="4" w:space="0" w:color="B9C6E2"/>
             </w:tcBorders>
           </w:tcPr>
-          <w:p/>
+          <w:p>
+            <w:r>
+              <w:rPr>
+                <w:color w:val="1A1A2E"/>
+                <w:sz w:val="18"/>
+              </w:rPr>
+              <w:t>js/api.js: fetch ke wger.de dan catatan form di localStorage. Diimpor apa adanya oleh app.js dan state.js.</w:t>
+            </w:r>
+          </w:p>
         </w:tc>
       </w:tr>
       <w:tr>
@@ -13968,7 +14245,7 @@
           <w:rFonts w:cs="Carlito"/>
           <w:sz w:val="20"/>
         </w:rPr>
-        <w:t>Tanda tangan: ______________________________     Tanggal: ______________     Jam selesai: __________</w:t>
+        <w:t>Tanda tangan: ______________________________     Tanggal: 16 Oktober 2026     Jam selesai: __________</w:t>
       </w:r>
     </w:p>
     <w:p>
@@ -15339,6 +15616,13 @@
             <w:pPr>
               <w:spacing w:before="20" w:after="20" w:line="252" w:lineRule="auto"/>
             </w:pPr>
+            <w:r>
+              <w:rPr>
+                <w:color w:val="1A1A2E"/>
+                <w:sz w:val="18"/>
+              </w:rPr>
+              <w:t>Setiap kali satu berkas butuh fungsi atau data dari berkas lain</w:t>
+            </w:r>
           </w:p>
         </w:tc>
       </w:tr>
@@ -15408,6 +15692,13 @@
             <w:pPr>
               <w:spacing w:before="20" w:after="20" w:line="252" w:lineRule="auto"/>
             </w:pPr>
+            <w:r>
+              <w:rPr>
+                <w:color w:val="1A1A2E"/>
+                <w:sz w:val="18"/>
+              </w:rPr>
+              <w:t>Di setiap import antarberkas, misalnya './data.js'</w:t>
+            </w:r>
           </w:p>
         </w:tc>
       </w:tr>
@@ -15477,6 +15768,13 @@
             <w:pPr>
               <w:spacing w:before="20" w:after="20" w:line="252" w:lineRule="auto"/>
             </w:pPr>
+            <w:r>
+              <w:rPr>
+                <w:color w:val="1A1A2E"/>
+                <w:sz w:val="18"/>
+              </w:rPr>
+              <w:t>Sekali, di state.js; dibaca render dan disimpan simpanan.js</w:t>
+            </w:r>
           </w:p>
         </w:tc>
       </w:tr>
@@ -15546,6 +15844,13 @@
             <w:pPr>
               <w:spacing w:before="20" w:after="20" w:line="252" w:lineRule="auto"/>
             </w:pPr>
+            <w:r>
+              <w:rPr>
+                <w:color w:val="1A1A2E"/>
+                <w:sz w:val="18"/>
+              </w:rPr>
+              <w:t>Setiap klik/ketik yang mengubah keadaan (pilihKategori, kirimForm)</w:t>
+            </w:r>
           </w:p>
         </w:tc>
       </w:tr>
@@ -15615,6 +15920,13 @@
             <w:pPr>
               <w:spacing w:before="20" w:after="20" w:line="252" w:lineRule="auto"/>
             </w:pPr>
+            <w:r>
+              <w:rPr>
+                <w:color w:val="1A1A2E"/>
+                <w:sz w:val="18"/>
+              </w:rPr>
+              <w:t>Di akhir setiap fungsi pengubah dan sekali saat halaman dimuat</w:t>
+            </w:r>
           </w:p>
         </w:tc>
       </w:tr>
@@ -15684,6 +15996,13 @@
             <w:pPr>
               <w:spacing w:before="20" w:after="20" w:line="252" w:lineRule="auto"/>
             </w:pPr>
+            <w:r>
+              <w:rPr>
+                <w:color w:val="1A1A2E"/>
+                <w:sz w:val="18"/>
+              </w:rPr>
+              <w:t>Sebelum setItem</w:t>
+            </w:r>
           </w:p>
         </w:tc>
       </w:tr>
@@ -15753,6 +16072,13 @@
             <w:pPr>
               <w:spacing w:before="20" w:after="20" w:line="252" w:lineRule="auto"/>
             </w:pPr>
+            <w:r>
+              <w:rPr>
+                <w:color w:val="1A1A2E"/>
+                <w:sz w:val="18"/>
+              </w:rPr>
+              <w:t>Sesudah getItem, di dalam try/catch</w:t>
+            </w:r>
           </w:p>
         </w:tc>
       </w:tr>
@@ -15822,6 +16148,13 @@
             <w:pPr>
               <w:spacing w:before="20" w:after="20" w:line="252" w:lineRule="auto"/>
             </w:pPr>
+            <w:r>
+              <w:rPr>
+                <w:color w:val="1A1A2E"/>
+                <w:sz w:val="18"/>
+              </w:rPr>
+              <w:t>setItem sesudah pilihan berubah; getItem sekali saat memuat</w:t>
+            </w:r>
           </w:p>
         </w:tc>
       </w:tr>
@@ -15891,6 +16224,13 @@
             <w:pPr>
               <w:spacing w:before="20" w:after="20" w:line="252" w:lineRule="auto"/>
             </w:pPr>
+            <w:r>
+              <w:rPr>
+                <w:color w:val="1A1A2E"/>
+                <w:sz w:val="18"/>
+              </w:rPr>
+              <w:t>Tombol atur ulang, dan saat simpanan rusak atau versinya lama</w:t>
+            </w:r>
           </w:p>
         </w:tc>
       </w:tr>
@@ -15960,6 +16300,13 @@
             <w:pPr>
               <w:spacing w:before="20" w:after="20" w:line="252" w:lineRule="auto"/>
             </w:pPr>
+            <w:r>
+              <w:rPr>
+                <w:color w:val="1A1A2E"/>
+                <w:sz w:val="18"/>
+              </w:rPr>
+              <w:t>Saat menyusun state awal dari hasil muat()</w:t>
+            </w:r>
           </w:p>
         </w:tc>
       </w:tr>

</xml_diff>